<commit_message>
API clients, document generation and template fixes
Co-Authored-By: Claude Opus 5.5 <noreply@anthropic.com>
Claude-Session: https://claude.ai/code/session_01Wj4AZbBCnK4nEs1W3PMLHj
</commit_message>
<xml_diff>
--- a/templates/confirmation_gross.docx
+++ b/templates/confirmation_gross.docx
@@ -2594,27 +2594,7 @@
               <w:rPr>
                 <w:color w:val="585858"/>
               </w:rPr>
-              <w:t>{{ s.course }}</w:t>
-            </w:r>
-            <w:r>
-              <w:rPr>
-                <w:color w:val="585858"/>
-              </w:rPr>
-              <w:t>,</w:t>
-            </w:r>
-            <w:r>
-              <w:rPr>
-                <w:color w:val="585858"/>
-                <w:spacing w:val="-7"/>
-              </w:rPr>
-              <w:t xml:space="preserve"> </w:t>
-            </w:r>
-            <w:r>
-              <w:rPr>
-                <w:color w:val="585858"/>
-                <w:spacing w:val="-7"/>
-              </w:rPr>
-              <w:t>{{ s.specialism }}</w:t>
+              <w:t>{{ s.programme }}</w:t>
             </w:r>
           </w:p>
         </w:tc>

</xml_diff>

<commit_message>
Receipt layout fixes, page break between students, unaccompanied minor fee on its own Xero account (210)
Co-Authored-By: Claude Opus 5.5 <noreply@anthropic.com>
</commit_message>
<xml_diff>
--- a/templates/confirmation_gross.docx
+++ b/templates/confirmation_gross.docx
@@ -2942,6 +2942,41 @@
         </w:tc>
       </w:tr>
     </w:tbl>
+    <w:p>
+      <w:pPr>
+        <w:pStyle w:val="Heading1"/>
+      </w:pPr>
+      <w:r>
+        <w:rPr>
+          <w:color w:val="585858"/>
+        </w:rPr>
+        <w:t>{%p if not loop.last %}</w:t>
+      </w:r>
+    </w:p>
+    <w:p>
+      <w:pPr>
+        <w:pStyle w:val="Heading1"/>
+      </w:pPr>
+      <w:r>
+        <w:rPr>
+          <w:color w:val="585858"/>
+        </w:rPr>
+      </w:r>
+      <w:r>
+        <w:br w:type="page"/>
+      </w:r>
+    </w:p>
+    <w:p>
+      <w:pPr>
+        <w:pStyle w:val="Heading1"/>
+      </w:pPr>
+      <w:r>
+        <w:rPr>
+          <w:color w:val="585858"/>
+        </w:rPr>
+        <w:t>{%p endif %}</w:t>
+      </w:r>
+    </w:p>
     <w:p>
       <w:pPr>
         <w:pStyle w:val="Heading1"/>

</xml_diff>